<commit_message>
Final data cleaning/Power query commit
</commit_message>
<xml_diff>
--- a/documentation.docx
+++ b/documentation.docx
@@ -237,15 +237,7 @@
     <w:p/>
     <w:p>
       <w:r>
-        <w:t>My first step was to change variable names I started from changing the area variable name I did the same for several others for example I changed ‘</w:t>
-      </w:r>
-      <w:proofErr w:type="spellStart"/>
-      <w:r>
-        <w:t>Age_of_Listing_in_days</w:t>
-      </w:r>
-      <w:proofErr w:type="spellEnd"/>
-      <w:r>
-        <w:t>’ to ‘Listing Age (days)’.</w:t>
+        <w:t>My first step was to change variable names I started from changing the area variable name I did the same for several others for example I changed ‘Age_of_Listing_in_days’ to ‘Listing Age (days)’.</w:t>
       </w:r>
     </w:p>
     <w:p>
@@ -368,15 +360,7 @@
         </w:drawing>
       </w:r>
       <w:r>
-        <w:t xml:space="preserve">The next steps </w:t>
-      </w:r>
-      <w:proofErr w:type="gramStart"/>
-      <w:r>
-        <w:t>was</w:t>
-      </w:r>
-      <w:proofErr w:type="gramEnd"/>
-      <w:r>
-        <w:t xml:space="preserve"> removing duplicate and blank </w:t>
+        <w:t xml:space="preserve">The next steps was removing duplicate and blank </w:t>
       </w:r>
       <w:r>
         <w:t>rows.</w:t>
@@ -648,10 +632,21 @@
     </w:p>
     <w:p>
       <w:pPr>
+        <w:pStyle w:val="Heading1"/>
+      </w:pPr>
+      <w:r>
+        <w:t>Advanced Power query</w:t>
+      </w:r>
+    </w:p>
+    <w:p>
+      <w:pPr>
         <w:pStyle w:val="Heading2"/>
       </w:pPr>
       <w:r>
-        <w:t>Custom columns</w:t>
+        <w:t xml:space="preserve"> </w:t>
+      </w:r>
+      <w:r>
+        <w:t>Creating a date table</w:t>
       </w:r>
     </w:p>
     <w:p>
@@ -660,10 +655,10 @@
           <w:noProof/>
         </w:rPr>
         <w:drawing>
-          <wp:inline distT="0" distB="0" distL="0" distR="0" wp14:anchorId="2458AA08" wp14:editId="7BA25777">
-            <wp:extent cx="5943600" cy="3704590"/>
-            <wp:effectExtent l="0" t="0" r="0" b="0"/>
-            <wp:docPr id="10" name="Picture 10"/>
+          <wp:inline distT="0" distB="0" distL="0" distR="0" wp14:anchorId="0A7EAE58" wp14:editId="0D8838FD">
+            <wp:extent cx="5943600" cy="3972560"/>
+            <wp:effectExtent l="0" t="0" r="0" b="8890"/>
+            <wp:docPr id="12" name="Picture 12"/>
             <wp:cNvGraphicFramePr>
               <a:graphicFrameLocks xmlns:a="http://schemas.openxmlformats.org/drawingml/2006/main" noChangeAspect="1"/>
             </wp:cNvGraphicFramePr>
@@ -683,7 +678,7 @@
                   <pic:spPr>
                     <a:xfrm>
                       <a:off x="0" y="0"/>
-                      <a:ext cx="5943600" cy="3704590"/>
+                      <a:ext cx="5943600" cy="3972560"/>
                     </a:xfrm>
                     <a:prstGeom prst="rect">
                       <a:avLst/>
@@ -698,15 +693,37 @@
     </w:p>
     <w:p>
       <w:r>
+        <w:lastRenderedPageBreak/>
+        <w:t xml:space="preserve">  </w:t>
+      </w:r>
+      <w:r>
+        <w:br w:type="textWrapping" w:clear="all"/>
+      </w:r>
+      <w:r>
+        <w:t>I created this date table with the above dax code t</w:t>
+      </w:r>
+      <w:r>
+        <w:t>o enable time-based analysis such as monthly, quarterly, and yearly trends. It also supports DAX time intelligence functions like YTD, MTD, and previous month comparisons, while providing a consistent calendar for reporting.</w:t>
+      </w:r>
+    </w:p>
+    <w:p>
+      <w:pPr>
+        <w:pStyle w:val="Heading2"/>
+      </w:pPr>
+      <w:r>
+        <w:t xml:space="preserve">Reference Query </w:t>
+      </w:r>
+    </w:p>
+    <w:p>
+      <w:r>
         <w:rPr>
           <w:noProof/>
         </w:rPr>
-        <w:lastRenderedPageBreak/>
         <w:drawing>
-          <wp:inline distT="0" distB="0" distL="0" distR="0" wp14:anchorId="17E22573" wp14:editId="33EF4D71">
-            <wp:extent cx="5943600" cy="3681095"/>
+          <wp:inline distT="0" distB="0" distL="0" distR="0" wp14:anchorId="08737FFF" wp14:editId="57C3EFAC">
+            <wp:extent cx="5943600" cy="1912620"/>
             <wp:effectExtent l="0" t="0" r="0" b="0"/>
-            <wp:docPr id="11" name="Picture 11"/>
+            <wp:docPr id="13" name="Picture 13"/>
             <wp:cNvGraphicFramePr>
               <a:graphicFrameLocks xmlns:a="http://schemas.openxmlformats.org/drawingml/2006/main" noChangeAspect="1"/>
             </wp:cNvGraphicFramePr>
@@ -726,7 +743,7 @@
                   <pic:spPr>
                     <a:xfrm>
                       <a:off x="0" y="0"/>
-                      <a:ext cx="5943600" cy="3681095"/>
+                      <a:ext cx="5943600" cy="1912620"/>
                     </a:xfrm>
                     <a:prstGeom prst="rect">
                       <a:avLst/>
@@ -741,16 +758,7 @@
     </w:p>
     <w:p>
       <w:r>
-        <w:t>I created two new columns showing size and luxury categories.</w:t>
-      </w:r>
-    </w:p>
-    <w:p>
-      <w:pPr>
-        <w:pStyle w:val="Heading1"/>
-      </w:pPr>
-      <w:r>
-        <w:lastRenderedPageBreak/>
-        <w:t>Advanced Power query</w:t>
+        <w:t>I added a Dubai reference table to create separate analysis tables (e.g., Dubai and Abu Dhabi properties) without duplicating the original dataset.</w:t>
       </w:r>
     </w:p>
     <w:p>
@@ -758,19 +766,19 @@
         <w:pStyle w:val="Heading2"/>
       </w:pPr>
       <w:r>
-        <w:t xml:space="preserve"> </w:t>
-      </w:r>
-      <w:r>
-        <w:t>Creating a date table</w:t>
-      </w:r>
-    </w:p>
-    <w:p>
-      <w:r>
+        <w:t>Custom columns</w:t>
+      </w:r>
+    </w:p>
+    <w:p>
+      <w:r>
+        <w:rPr>
+          <w:noProof/>
+        </w:rPr>
         <w:drawing>
-          <wp:inline distT="0" distB="0" distL="0" distR="0" wp14:anchorId="0A7EAE58" wp14:editId="0D8838FD">
-            <wp:extent cx="5943600" cy="3972560"/>
-            <wp:effectExtent l="0" t="0" r="0" b="8890"/>
-            <wp:docPr id="12" name="Picture 12"/>
+          <wp:inline distT="0" distB="0" distL="0" distR="0" wp14:anchorId="4C9BF91A" wp14:editId="16B034A9">
+            <wp:extent cx="5943600" cy="3704590"/>
+            <wp:effectExtent l="0" t="0" r="0" b="0"/>
+            <wp:docPr id="10" name="Picture 10"/>
             <wp:cNvGraphicFramePr>
               <a:graphicFrameLocks xmlns:a="http://schemas.openxmlformats.org/drawingml/2006/main" noChangeAspect="1"/>
             </wp:cNvGraphicFramePr>
@@ -790,7 +798,7 @@
                   <pic:spPr>
                     <a:xfrm>
                       <a:off x="0" y="0"/>
-                      <a:ext cx="5943600" cy="3972560"/>
+                      <a:ext cx="5943600" cy="3704590"/>
                     </a:xfrm>
                     <a:prstGeom prst="rect">
                       <a:avLst/>
@@ -805,41 +813,15 @@
     </w:p>
     <w:p>
       <w:r>
-        <w:t xml:space="preserve">  </w:t>
-      </w:r>
-      <w:r>
-        <w:br w:type="textWrapping" w:clear="all"/>
-      </w:r>
-      <w:r>
-        <w:t xml:space="preserve">I created this date table with the above </w:t>
-      </w:r>
-      <w:proofErr w:type="spellStart"/>
-      <w:r>
-        <w:t>dax</w:t>
-      </w:r>
-      <w:proofErr w:type="spellEnd"/>
-      <w:r>
-        <w:t xml:space="preserve"> code t</w:t>
-      </w:r>
-      <w:r>
-        <w:t>o enable time-based analysis such as monthly, quarterly, and yearly trends. It also supports DAX time intelligence functions like YTD, MTD, and previous month comparisons, while providing a consistent calendar for reporting.</w:t>
-      </w:r>
-    </w:p>
-    <w:p>
-      <w:pPr>
-        <w:pStyle w:val="Heading2"/>
-      </w:pPr>
-      <w:r>
-        <w:t xml:space="preserve">Reference Query </w:t>
-      </w:r>
-    </w:p>
-    <w:p>
-      <w:r>
+        <w:rPr>
+          <w:noProof/>
+        </w:rPr>
+        <w:lastRenderedPageBreak/>
         <w:drawing>
-          <wp:inline distT="0" distB="0" distL="0" distR="0" wp14:anchorId="08737FFF" wp14:editId="57C3EFAC">
-            <wp:extent cx="5943600" cy="1912620"/>
+          <wp:inline distT="0" distB="0" distL="0" distR="0" wp14:anchorId="1F6ECEC0" wp14:editId="4F67DDF6">
+            <wp:extent cx="5943600" cy="3051810"/>
             <wp:effectExtent l="0" t="0" r="0" b="0"/>
-            <wp:docPr id="13" name="Picture 13"/>
+            <wp:docPr id="14" name="Picture 14"/>
             <wp:cNvGraphicFramePr>
               <a:graphicFrameLocks xmlns:a="http://schemas.openxmlformats.org/drawingml/2006/main" noChangeAspect="1"/>
             </wp:cNvGraphicFramePr>
@@ -859,7 +841,7 @@
                   <pic:spPr>
                     <a:xfrm>
                       <a:off x="0" y="0"/>
-                      <a:ext cx="5943600" cy="1912620"/>
+                      <a:ext cx="5943600" cy="3051810"/>
                     </a:xfrm>
                     <a:prstGeom prst="rect">
                       <a:avLst/>
@@ -874,10 +856,7 @@
     </w:p>
     <w:p>
       <w:r>
-        <w:t>I added a Dubai reference table to</w:t>
-      </w:r>
-      <w:r>
-        <w:t xml:space="preserve"> create separate analysis tables (e.g., Dubai and Abu Dhabi properties) without duplicating the original dataset.</w:t>
+        <w:t>I created two new columns showing size and luxury categories.</w:t>
       </w:r>
     </w:p>
     <w:p>
@@ -885,12 +864,14 @@
         <w:pStyle w:val="Heading2"/>
       </w:pPr>
       <w:r>
-        <w:lastRenderedPageBreak/>
         <w:t>Group by with multiple aggregations</w:t>
       </w:r>
     </w:p>
     <w:p>
       <w:r>
+        <w:rPr>
+          <w:noProof/>
+        </w:rPr>
         <w:drawing>
           <wp:inline distT="0" distB="0" distL="0" distR="0" wp14:anchorId="19C0E19F" wp14:editId="611845D7">
             <wp:extent cx="5943600" cy="2491740"/>
@@ -943,6 +924,111 @@
       </w:r>
     </w:p>
     <w:p>
+      <w:pPr>
+        <w:pStyle w:val="Heading2"/>
+      </w:pPr>
+      <w:r>
+        <w:lastRenderedPageBreak/>
+        <w:t>Summarized Table</w:t>
+      </w:r>
+    </w:p>
+    <w:p>
+      <w:r>
+        <w:rPr>
+          <w:noProof/>
+        </w:rPr>
+        <w:drawing>
+          <wp:inline distT="0" distB="0" distL="0" distR="0" wp14:anchorId="21A13CF0" wp14:editId="651EF553">
+            <wp:extent cx="5943600" cy="1992630"/>
+            <wp:effectExtent l="0" t="0" r="0" b="7620"/>
+            <wp:docPr id="16" name="Picture 16"/>
+            <wp:cNvGraphicFramePr>
+              <a:graphicFrameLocks xmlns:a="http://schemas.openxmlformats.org/drawingml/2006/main" noChangeAspect="1"/>
+            </wp:cNvGraphicFramePr>
+            <a:graphic xmlns:a="http://schemas.openxmlformats.org/drawingml/2006/main">
+              <a:graphicData uri="http://schemas.openxmlformats.org/drawingml/2006/picture">
+                <pic:pic xmlns:pic="http://schemas.openxmlformats.org/drawingml/2006/picture">
+                  <pic:nvPicPr>
+                    <pic:cNvPr id="1" name=""/>
+                    <pic:cNvPicPr/>
+                  </pic:nvPicPr>
+                  <pic:blipFill>
+                    <a:blip r:embed="rId17"/>
+                    <a:stretch>
+                      <a:fillRect/>
+                    </a:stretch>
+                  </pic:blipFill>
+                  <pic:spPr>
+                    <a:xfrm>
+                      <a:off x="0" y="0"/>
+                      <a:ext cx="5943600" cy="1992630"/>
+                    </a:xfrm>
+                    <a:prstGeom prst="rect">
+                      <a:avLst/>
+                    </a:prstGeom>
+                  </pic:spPr>
+                </pic:pic>
+              </a:graphicData>
+            </a:graphic>
+          </wp:inline>
+        </w:drawing>
+      </w:r>
+    </w:p>
+    <w:p>
+      <w:r>
+        <w:t>I created a summarized table to re-aggregated tables that provide quick summaries for dashboards, improve query performance, and support high-level business reporting.</w:t>
+      </w:r>
+    </w:p>
+    <w:p>
+      <w:pPr>
+        <w:pStyle w:val="Heading1"/>
+      </w:pPr>
+      <w:r>
+        <w:lastRenderedPageBreak/>
+        <w:t xml:space="preserve">Applied steps </w:t>
+      </w:r>
+    </w:p>
+    <w:p>
+      <w:pPr>
+        <w:pStyle w:val="Heading1"/>
+      </w:pPr>
+      <w:r>
+        <w:drawing>
+          <wp:inline distT="0" distB="0" distL="0" distR="0" wp14:anchorId="7BED86FE" wp14:editId="6260C452">
+            <wp:extent cx="2391109" cy="5048955"/>
+            <wp:effectExtent l="0" t="0" r="9525" b="0"/>
+            <wp:docPr id="11" name="Picture 11"/>
+            <wp:cNvGraphicFramePr>
+              <a:graphicFrameLocks xmlns:a="http://schemas.openxmlformats.org/drawingml/2006/main" noChangeAspect="1"/>
+            </wp:cNvGraphicFramePr>
+            <a:graphic xmlns:a="http://schemas.openxmlformats.org/drawingml/2006/main">
+              <a:graphicData uri="http://schemas.openxmlformats.org/drawingml/2006/picture">
+                <pic:pic xmlns:pic="http://schemas.openxmlformats.org/drawingml/2006/picture">
+                  <pic:nvPicPr>
+                    <pic:cNvPr id="1" name=""/>
+                    <pic:cNvPicPr/>
+                  </pic:nvPicPr>
+                  <pic:blipFill>
+                    <a:blip r:embed="rId18"/>
+                    <a:stretch>
+                      <a:fillRect/>
+                    </a:stretch>
+                  </pic:blipFill>
+                  <pic:spPr>
+                    <a:xfrm>
+                      <a:off x="0" y="0"/>
+                      <a:ext cx="2391109" cy="5048955"/>
+                    </a:xfrm>
+                    <a:prstGeom prst="rect">
+                      <a:avLst/>
+                    </a:prstGeom>
+                  </pic:spPr>
+                </pic:pic>
+              </a:graphicData>
+            </a:graphic>
+          </wp:inline>
+        </w:drawing>
+      </w:r>
       <w:r>
         <w:t xml:space="preserve">    </w:t>
       </w:r>

</xml_diff>